<commit_message>
feat: update admin section, UIs, Msal permissions & docs
</commit_message>
<xml_diff>
--- a/docs/midterm/MidTermDoc.docx
+++ b/docs/midterm/MidTermDoc.docx
@@ -1883,7 +1883,7 @@
           </w:tcPr>
           <w:p>
             <w:r>
-              <w:t>c480598459b823c9e6b310eb75c36e75653b1b69 (Tue Jul 14 23:36:35 2026)</w:t>
+              <w:t>d07c70f4e4ec6536d760401a39b9f4f7b7e6e409 (Wed Jul 15 00:34:53 2026 +0530)</w:t>
             </w:r>
           </w:p>
         </w:tc>
@@ -2074,7 +2074,7 @@
           </w:tcPr>
           <w:p>
             <w:r>
-              <w:t>100+ tests execution</w:t>
+              <w:t>1 test (HomeComponent)</w:t>
             </w:r>
           </w:p>
         </w:tc>
@@ -2084,59 +2084,7 @@
           </w:tcPr>
           <w:p>
             <w:r>
-              <w:t>100% Statements / 97.56% Br</w:t>
-            </w:r>
-          </w:p>
-        </w:tc>
-        <w:tc>
-          <w:tcPr>
-            <w:tcW w:type="dxa" w:w="1728"/>
-          </w:tcPr>
-          <w:p>
-            <w:r>
-              <w:t>80%</w:t>
-            </w:r>
-          </w:p>
-        </w:tc>
-        <w:tc>
-          <w:tcPr>
-            <w:tcW w:type="dxa" w:w="1728"/>
-          </w:tcPr>
-          <w:p>
-            <w:r>
-              <w:t>N/A</w:t>
-            </w:r>
-          </w:p>
-        </w:tc>
-      </w:tr>
-      <w:tr>
-        <w:tc>
-          <w:tcPr>
-            <w:tcW w:type="dxa" w:w="1728"/>
-          </w:tcPr>
-          <w:p>
-            <w:r>
-              <w:t>Server Integration Tests (Jest)</w:t>
-            </w:r>
-          </w:p>
-        </w:tc>
-        <w:tc>
-          <w:tcPr>
-            <w:tcW w:type="dxa" w:w="1728"/>
-          </w:tcPr>
-          <w:p>
-            <w:r>
-              <w:t>6 routes test cases</w:t>
-            </w:r>
-          </w:p>
-        </w:tc>
-        <w:tc>
-          <w:tcPr>
-            <w:tcW w:type="dxa" w:w="1728"/>
-          </w:tcPr>
-          <w:p>
-            <w:r>
-              <w:t>41.52% Statements / 17.29% Br</w:t>
+              <w:t>10%</w:t>
             </w:r>
           </w:p>
         </w:tc>

</xml_diff>